<commit_message>
Round 17-20: controlled L1 check + real SFT evidence + honest v2 preflight
- Round 17: prompt/tool/budget/seed-matched L1 evidence check (Static 19/20 vs L1 20/20; one discordant pair, exact McNemar p=1.0)
- Round 18: executable-candidate check negative; unconverted SmolLM2 checkpoint rejected
- Round 19: two real SmolLM2-135M SFT runs rejected on held-out protocol
- Round 20: corrected loss mask; frozen 80-task test candidate 80/80 vs base 0/80 (McNemar p=1.65e-24), deployment not accepted
- GAIA2 official/routed dev probes recorded as development-only, not paper evidence
- New submission preflight script and unit tests (43/43 pass)
- Manuscript v2 date and artifacts rebuilt; REPORT rounds 32-37 added
</commit_message>
<xml_diff>
--- a/papers/docx/00_INDEX.docx
+++ b/papers/docx/00_INDEX.docx
@@ -4,231 +4,595 @@
   <w:body>
     <w:p>
       <w:pPr>
+        <w:pStyle w:val="Title"/>
+        <w:jc w:val="center"/>
+      </w:pPr>
+      <w:r>
+        <w:rPr>
+          <w:rFonts w:ascii="Times New Roman" w:hAnsi="Times New Roman" w:eastAsia="Times New Roman"/>
+          <w:b/>
+          <w:sz w:val="34"/>
+        </w:rPr>
+        <w:t>AGI Research Kit: Unified Preprint v2</w:t>
+      </w:r>
+    </w:p>
+    <w:p>
+      <w:pPr>
         <w:pStyle w:val="Heading1"/>
       </w:pPr>
       <w:r>
         <w:rPr>
-          <w:rFonts w:ascii="Times New Roman" w:hAnsi="Times New Roman"/>
-          <w:color w:val="003366"/>
+          <w:rFonts w:ascii="Times New Roman" w:hAnsi="Times New Roman" w:eastAsia="Times New Roman"/>
+          <w:sz w:val="28"/>
         </w:rPr>
-        <w:t>AGI Research Kit</w:t>
+        <w:t>AGI Kit: An End-to-End Self-Improving Tool-Use Pipeline on Consumer Hardware - Empirical Observations</w:t>
       </w:r>
     </w:p>
     <w:p>
       <w:r>
         <w:rPr>
-          <w:rFonts w:ascii="Times New Roman" w:hAnsi="Times New Roman"/>
-          <w:sz w:val="22"/>
+          <w:rFonts w:ascii="Times New Roman" w:hAnsi="Times New Roman" w:eastAsia="Times New Roman"/>
+          <w:b/>
+          <w:sz w:val="21"/>
         </w:rPr>
-        <w:t>AGI Research Kit</w:t>
+        <w:t>Authors:</w:t>
+      </w:r>
+      <w:r>
+        <w:rPr>
+          <w:rFonts w:ascii="Times New Roman" w:hAnsi="Times New Roman" w:eastAsia="Times New Roman"/>
+          <w:sz w:val="21"/>
+        </w:rPr>
+        <w:t xml:space="preserve"> AGI Research Kit Contributors </w:t>
+      </w:r>
+      <w:r>
+        <w:rPr>
+          <w:rFonts w:ascii="Times New Roman" w:hAnsi="Times New Roman" w:eastAsia="Times New Roman"/>
+          <w:b/>
+          <w:sz w:val="21"/>
+        </w:rPr>
+        <w:t>Date:</w:t>
+      </w:r>
+      <w:r>
+        <w:rPr>
+          <w:rFonts w:ascii="Times New Roman" w:hAnsi="Times New Roman" w:eastAsia="Times New Roman"/>
+          <w:sz w:val="21"/>
+        </w:rPr>
+        <w:t xml:space="preserve"> 2026-08-02 </w:t>
+      </w:r>
+      <w:r>
+        <w:rPr>
+          <w:rFonts w:ascii="Times New Roman" w:hAnsi="Times New Roman" w:eastAsia="Times New Roman"/>
+          <w:b/>
+          <w:sz w:val="21"/>
+        </w:rPr>
+        <w:t>Status:</w:t>
+      </w:r>
+      <w:r>
+        <w:rPr>
+          <w:rFonts w:ascii="Times New Roman" w:hAnsi="Times New Roman" w:eastAsia="Times New Roman"/>
+          <w:sz w:val="21"/>
+        </w:rPr>
+        <w:t xml:space="preserve"> Submission draft; not yet submitted</w:t>
       </w:r>
     </w:p>
     <w:p>
       <w:pPr>
-        <w:pStyle w:val="Heading2"/>
+        <w:pStyle w:val="Heading1"/>
       </w:pPr>
       <w:r>
         <w:rPr>
-          <w:rFonts w:ascii="Times New Roman" w:hAnsi="Times New Roman"/>
-          <w:color w:val="003366"/>
+          <w:rFonts w:ascii="Times New Roman" w:hAnsi="Times New Roman" w:eastAsia="Times New Roman"/>
+          <w:sz w:val="28"/>
         </w:rPr>
-        <w:t>Five Papers for TMLR Submission (English Bundle)</w:t>
+        <w:t>Evidence Summary</w:t>
+      </w:r>
+    </w:p>
+    <w:p>
+      <w:pPr>
+        <w:pStyle w:val="ListBullet"/>
+      </w:pPr>
+      <w:r>
+        <w:rPr>
+          <w:rFonts w:ascii="Times New Roman" w:hAnsi="Times New Roman" w:eastAsia="Times New Roman"/>
+          <w:sz w:val="21"/>
+        </w:rPr>
+        <w:t>Five synthetic ablation configurations: **77.8% final-emission for</w:t>
       </w:r>
     </w:p>
     <w:p>
       <w:r>
         <w:rPr>
-          <w:rFonts w:ascii="Times New Roman" w:hAnsi="Times New Roman"/>
-          <w:sz w:val="22"/>
+          <w:rFonts w:ascii="Times New Roman" w:hAnsi="Times New Roman" w:eastAsia="Times New Roman"/>
+          <w:sz w:val="21"/>
         </w:rPr>
-        <w:t>Five Papers for TMLR Submission (English Bundle)</w:t>
+        <w:t>every configuration**; the evaluation is saturated and does not identify component effects.</w:t>
+      </w:r>
+    </w:p>
+    <w:p>
+      <w:pPr>
+        <w:pStyle w:val="ListBullet"/>
+      </w:pPr>
+      <w:r>
+        <w:rPr>
+          <w:rFonts w:ascii="Times New Roman" w:hAnsi="Times New Roman" w:eastAsia="Times New Roman"/>
+          <w:sz w:val="21"/>
+        </w:rPr>
+        <w:t xml:space="preserve">Hard 20-task arithmetic evaluation: bare Qwen3-1.7B scores </w:t>
+      </w:r>
+      <w:r>
+        <w:rPr>
+          <w:rFonts w:ascii="Times New Roman" w:hAnsi="Times New Roman" w:eastAsia="Times New Roman"/>
+          <w:b/>
+          <w:sz w:val="21"/>
+        </w:rPr>
+        <w:t>5.0%</w:t>
       </w:r>
     </w:p>
     <w:p>
       <w:r>
         <w:rPr>
-          <w:rFonts w:ascii="Times New Roman" w:hAnsi="Times New Roman"/>
-          <w:sz w:val="22"/>
+          <w:rFonts w:ascii="Times New Roman" w:hAnsi="Times New Roman" w:eastAsia="Times New Roman"/>
+          <w:sz w:val="21"/>
         </w:rPr>
-        <w:t>This bundle contains five interconnected papers documenting the AGI</w:t>
+        <w:t xml:space="preserve">at three steps and </w:t>
+      </w:r>
+      <w:r>
+        <w:rPr>
+          <w:rFonts w:ascii="Times New Roman" w:hAnsi="Times New Roman" w:eastAsia="Times New Roman"/>
+          <w:b/>
+          <w:sz w:val="21"/>
+        </w:rPr>
+        <w:t>35.0%</w:t>
+      </w:r>
+      <w:r>
+        <w:rPr>
+          <w:rFonts w:ascii="Times New Roman" w:hAnsi="Times New Roman" w:eastAsia="Times New Roman"/>
+          <w:sz w:val="21"/>
+        </w:rPr>
+        <w:t xml:space="preserve"> at six steps; the full configuration records 100.0% structural completion and </w:t>
+      </w:r>
+      <w:r>
+        <w:rPr>
+          <w:rFonts w:ascii="Times New Roman" w:hAnsi="Times New Roman" w:eastAsia="Times New Roman"/>
+          <w:b/>
+          <w:sz w:val="21"/>
+        </w:rPr>
+        <w:t>95.0% correctness</w:t>
+      </w:r>
+      <w:r>
+        <w:rPr>
+          <w:rFonts w:ascii="Times New Roman" w:hAnsi="Times New Roman" w:eastAsia="Times New Roman"/>
+          <w:sz w:val="21"/>
+        </w:rPr>
+        <w:t xml:space="preserve"> after an independent gold recheck. The 60-point matched-step difference remains confounded by prompt structure and control flow.</w:t>
+      </w:r>
+    </w:p>
+    <w:p>
+      <w:pPr>
+        <w:pStyle w:val="ListBullet"/>
+      </w:pPr>
+      <w:r>
+        <w:rPr>
+          <w:rFonts w:ascii="Times New Roman" w:hAnsi="Times New Roman" w:eastAsia="Times New Roman"/>
+          <w:sz w:val="21"/>
+        </w:rPr>
+        <w:t>Controlled L1 check: on a separate fixed 20-task held-out split with</w:t>
       </w:r>
     </w:p>
     <w:p>
       <w:r>
         <w:rPr>
-          <w:rFonts w:ascii="Times New Roman" w:hAnsi="Times New Roman"/>
-          <w:sz w:val="22"/>
+          <w:rFonts w:ascii="Times New Roman" w:hAnsi="Times New Roman" w:eastAsia="Times New Roman"/>
+          <w:sz w:val="21"/>
         </w:rPr>
-        <w:t>Research Kit, a complete self-improving tool-use agent architecture</w:t>
+        <w:t xml:space="preserve">matched prompt/tool/budget/model-seed settings, Static scores </w:t>
+      </w:r>
+      <w:r>
+        <w:rPr>
+          <w:rFonts w:ascii="Times New Roman" w:hAnsi="Times New Roman" w:eastAsia="Times New Roman"/>
+          <w:b/>
+          <w:sz w:val="21"/>
+        </w:rPr>
+        <w:t>19/20</w:t>
+      </w:r>
+      <w:r>
+        <w:rPr>
+          <w:rFonts w:ascii="Times New Roman" w:hAnsi="Times New Roman" w:eastAsia="Times New Roman"/>
+          <w:sz w:val="21"/>
+        </w:rPr>
+        <w:t xml:space="preserve"> and L1 reflection-and-verification scores </w:t>
+      </w:r>
+      <w:r>
+        <w:rPr>
+          <w:rFonts w:ascii="Times New Roman" w:hAnsi="Times New Roman" w:eastAsia="Times New Roman"/>
+          <w:b/>
+          <w:sz w:val="21"/>
+        </w:rPr>
+        <w:t>20/20</w:t>
+      </w:r>
+      <w:r>
+        <w:rPr>
+          <w:rFonts w:ascii="Times New Roman" w:hAnsi="Times New Roman" w:eastAsia="Times New Roman"/>
+          <w:sz w:val="21"/>
+        </w:rPr>
+        <w:t>. The only discordant pair is an auditable correction, but exact p=1.0; this is not a general superiority claim.</w:t>
+      </w:r>
+    </w:p>
+    <w:p>
+      <w:pPr>
+        <w:pStyle w:val="ListBullet"/>
+      </w:pPr>
+      <w:r>
+        <w:rPr>
+          <w:rFonts w:ascii="Times New Roman" w:hAnsi="Times New Roman" w:eastAsia="Times New Roman"/>
+          <w:sz w:val="21"/>
+        </w:rPr>
+        <w:t xml:space="preserve">Retroactive gold re-evaluation: </w:t>
+      </w:r>
+      <w:r>
+        <w:rPr>
+          <w:rFonts w:ascii="Times New Roman" w:hAnsi="Times New Roman" w:eastAsia="Times New Roman"/>
+          <w:b/>
+          <w:sz w:val="21"/>
+        </w:rPr>
+        <w:t>77.6% correctness</w:t>
+      </w:r>
+      <w:r>
+        <w:rPr>
+          <w:rFonts w:ascii="Times New Roman" w:hAnsi="Times New Roman" w:eastAsia="Times New Roman"/>
+          <w:sz w:val="21"/>
+        </w:rPr>
+        <w:t xml:space="preserve"> on the</w:t>
       </w:r>
     </w:p>
     <w:p>
       <w:r>
         <w:rPr>
-          <w:rFonts w:ascii="Times New Roman" w:hAnsi="Times New Roman"/>
-          <w:sz w:val="22"/>
+          <w:rFonts w:ascii="Times New Roman" w:hAnsi="Times New Roman" w:eastAsia="Times New Roman"/>
+          <w:sz w:val="21"/>
         </w:rPr>
-        <w:t>running on a 1.7B-parameter language model on consumer hardware.</w:t>
+        <w:t>85-episode arithmetic subset of 138 historical episodes.</w:t>
       </w:r>
     </w:p>
     <w:p>
       <w:pPr>
-        <w:pStyle w:val="Heading2"/>
+        <w:pStyle w:val="ListBullet"/>
       </w:pPr>
       <w:r>
         <w:rPr>
-          <w:rFonts w:ascii="Times New Roman" w:hAnsi="Times New Roman"/>
-          <w:color w:val="003366"/>
+          <w:rFonts w:ascii="Times New Roman" w:hAnsi="Times New Roman" w:eastAsia="Times New Roman"/>
+          <w:sz w:val="21"/>
         </w:rPr>
-        <w:t>Paper 1: Self-Critique as a First-Class Abstraction</w:t>
+        <w:t xml:space="preserve">Safety gate: </w:t>
+      </w:r>
+      <w:r>
+        <w:rPr>
+          <w:rFonts w:ascii="Times New Roman" w:hAnsi="Times New Roman" w:eastAsia="Times New Roman"/>
+          <w:b/>
+          <w:sz w:val="21"/>
+        </w:rPr>
+        <w:t>12/12</w:t>
+      </w:r>
+      <w:r>
+        <w:rPr>
+          <w:rFonts w:ascii="Times New Roman" w:hAnsi="Times New Roman" w:eastAsia="Times New Roman"/>
+          <w:sz w:val="21"/>
+        </w:rPr>
+        <w:t xml:space="preserve"> deterministic boundary cases passed.</w:t>
+      </w:r>
+    </w:p>
+    <w:p>
+      <w:pPr>
+        <w:pStyle w:val="ListBullet"/>
+      </w:pPr>
+      <w:r>
+        <w:rPr>
+          <w:rFonts w:ascii="Times New Roman" w:hAnsi="Times New Roman" w:eastAsia="Times New Roman"/>
+          <w:sz w:val="21"/>
+        </w:rPr>
+        <w:t xml:space="preserve">Production SchemaMutator policy test: </w:t>
+      </w:r>
+      <w:r>
+        <w:rPr>
+          <w:rFonts w:ascii="Times New Roman" w:hAnsi="Times New Roman" w:eastAsia="Times New Roman"/>
+          <w:b/>
+          <w:sz w:val="21"/>
+        </w:rPr>
+        <w:t>18/18</w:t>
+      </w:r>
+      <w:r>
+        <w:rPr>
+          <w:rFonts w:ascii="Times New Roman" w:hAnsi="Times New Roman" w:eastAsia="Times New Roman"/>
+          <w:sz w:val="21"/>
+        </w:rPr>
+        <w:t xml:space="preserve"> invalid changes</w:t>
       </w:r>
     </w:p>
     <w:p>
       <w:r>
         <w:rPr>
-          <w:rFonts w:ascii="Times New Roman" w:hAnsi="Times New Roman"/>
-          <w:sz w:val="22"/>
+          <w:rFonts w:ascii="Times New Roman" w:hAnsi="Times New Roman" w:eastAsia="Times New Roman"/>
+          <w:sz w:val="21"/>
         </w:rPr>
-        <w:t>Paper 1: Self-Critique as a First-Class Abstraction</w:t>
+        <w:t xml:space="preserve">blocked and </w:t>
+      </w:r>
+      <w:r>
+        <w:rPr>
+          <w:rFonts w:ascii="Times New Roman" w:hAnsi="Times New Roman" w:eastAsia="Times New Roman"/>
+          <w:b/>
+          <w:sz w:val="21"/>
+        </w:rPr>
+        <w:t>12/12</w:t>
+      </w:r>
+      <w:r>
+        <w:rPr>
+          <w:rFonts w:ascii="Times New Roman" w:hAnsi="Times New Roman" w:eastAsia="Times New Roman"/>
+          <w:sz w:val="21"/>
+        </w:rPr>
+        <w:t xml:space="preserve"> valid in-range controls accepted.</w:t>
+      </w:r>
+    </w:p>
+    <w:p>
+      <w:pPr>
+        <w:pStyle w:val="ListBullet"/>
+      </w:pPr>
+      <w:r>
+        <w:rPr>
+          <w:rFonts w:ascii="Times New Roman" w:hAnsi="Times New Roman" w:eastAsia="Times New Roman"/>
+          <w:sz w:val="21"/>
+        </w:rPr>
+        <w:t>Historical repeated-run result: 62.5%, 62.5%, and 56.2% over three</w:t>
       </w:r>
     </w:p>
     <w:p>
       <w:r>
         <w:rPr>
-          <w:rFonts w:ascii="Times New Roman" w:hAnsi="Times New Roman"/>
-          <w:sz w:val="22"/>
+          <w:rFonts w:ascii="Times New Roman" w:hAnsi="Times New Roman" w:eastAsia="Times New Roman"/>
+          <w:sz w:val="21"/>
         </w:rPr>
-        <w:t>Key Result: 30% → 51% success rate</w:t>
+        <w:t>16-episode runs. This result is descriptive only because seed control and artifact provenance are incomplete.</w:t>
       </w:r>
     </w:p>
     <w:p>
       <w:pPr>
-        <w:pStyle w:val="Heading2"/>
+        <w:pStyle w:val="Heading1"/>
       </w:pPr>
       <w:r>
         <w:rPr>
-          <w:rFonts w:ascii="Times New Roman" w:hAnsi="Times New Roman"/>
-          <w:color w:val="003366"/>
+          <w:rFonts w:ascii="Times New Roman" w:hAnsi="Times New Roman" w:eastAsia="Times New Roman"/>
+          <w:sz w:val="28"/>
         </w:rPr>
-        <w:t>Paper 2: Semantic Strategy Memory with Rule-Based Meta-Control</w:t>
+        <w:t>Primary Files</w:t>
+      </w:r>
+    </w:p>
+    <w:p>
+      <w:pPr>
+        <w:pStyle w:val="ListBullet"/>
+      </w:pPr>
+      <w:r>
+        <w:rPr>
+          <w:rFonts w:ascii="Courier New" w:hAnsi="Courier New" w:eastAsia="Courier New"/>
+          <w:sz w:val="19"/>
+        </w:rPr>
+        <w:t>preprint_unified_en.md</w:t>
+      </w:r>
+      <w:r>
+        <w:rPr>
+          <w:rFonts w:ascii="Times New Roman" w:hAnsi="Times New Roman" w:eastAsia="Times New Roman"/>
+          <w:sz w:val="21"/>
+        </w:rPr>
+        <w:t>: manuscript source</w:t>
+      </w:r>
+    </w:p>
+    <w:p>
+      <w:pPr>
+        <w:pStyle w:val="ListBullet"/>
+      </w:pPr>
+      <w:r>
+        <w:rPr>
+          <w:rFonts w:ascii="Courier New" w:hAnsi="Courier New" w:eastAsia="Courier New"/>
+          <w:sz w:val="19"/>
+        </w:rPr>
+        <w:t>preprint_unified_en.pdf</w:t>
+      </w:r>
+      <w:r>
+        <w:rPr>
+          <w:rFonts w:ascii="Times New Roman" w:hAnsi="Times New Roman" w:eastAsia="Times New Roman"/>
+          <w:sz w:val="21"/>
+        </w:rPr>
+        <w:t>: PDF build</w:t>
+      </w:r>
+    </w:p>
+    <w:p>
+      <w:pPr>
+        <w:pStyle w:val="ListBullet"/>
+      </w:pPr>
+      <w:r>
+        <w:rPr>
+          <w:rFonts w:ascii="Courier New" w:hAnsi="Courier New" w:eastAsia="Courier New"/>
+          <w:sz w:val="19"/>
+        </w:rPr>
+        <w:t>docx/preprint_unified_en.docx</w:t>
+      </w:r>
+      <w:r>
+        <w:rPr>
+          <w:rFonts w:ascii="Times New Roman" w:hAnsi="Times New Roman" w:eastAsia="Times New Roman"/>
+          <w:sz w:val="21"/>
+        </w:rPr>
+        <w:t>: editable submission draft</w:t>
+      </w:r>
+    </w:p>
+    <w:p>
+      <w:pPr>
+        <w:pStyle w:val="ListBullet"/>
+      </w:pPr>
+      <w:r>
+        <w:rPr>
+          <w:rFonts w:ascii="Courier New" w:hAnsi="Courier New" w:eastAsia="Courier New"/>
+          <w:sz w:val="19"/>
+        </w:rPr>
+        <w:t>COVER_LETTER.md</w:t>
+      </w:r>
+      <w:r>
+        <w:rPr>
+          <w:rFonts w:ascii="Times New Roman" w:hAnsi="Times New Roman" w:eastAsia="Times New Roman"/>
+          <w:sz w:val="21"/>
+        </w:rPr>
+        <w:t>: TMLR cover-letter draft</w:t>
+      </w:r>
+    </w:p>
+    <w:p>
+      <w:pPr>
+        <w:pStyle w:val="ListBullet"/>
+      </w:pPr>
+      <w:r>
+        <w:rPr>
+          <w:rFonts w:ascii="Courier New" w:hAnsi="Courier New" w:eastAsia="Courier New"/>
+          <w:sz w:val="19"/>
+        </w:rPr>
+        <w:t>PUBLISHING.md</w:t>
+      </w:r>
+      <w:r>
+        <w:rPr>
+          <w:rFonts w:ascii="Times New Roman" w:hAnsi="Times New Roman" w:eastAsia="Times New Roman"/>
+          <w:sz w:val="21"/>
+        </w:rPr>
+        <w:t>: submission preflight and workflow</w:t>
+      </w:r>
+    </w:p>
+    <w:p>
+      <w:pPr>
+        <w:pStyle w:val="ListBullet"/>
+      </w:pPr>
+      <w:r>
+        <w:rPr>
+          <w:rFonts w:ascii="Courier New" w:hAnsi="Courier New" w:eastAsia="Courier New"/>
+          <w:sz w:val="19"/>
+        </w:rPr>
+        <w:t>figures/</w:t>
+      </w:r>
+      <w:r>
+        <w:rPr>
+          <w:rFonts w:ascii="Times New Roman" w:hAnsi="Times New Roman" w:eastAsia="Times New Roman"/>
+          <w:sz w:val="21"/>
+        </w:rPr>
+        <w:t>: generated plots; the manuscript embeds only Figures 1</w:t>
       </w:r>
     </w:p>
     <w:p>
       <w:r>
         <w:rPr>
-          <w:rFonts w:ascii="Times New Roman" w:hAnsi="Times New Roman"/>
-          <w:sz w:val="22"/>
+          <w:rFonts w:ascii="Times New Roman" w:hAnsi="Times New Roman" w:eastAsia="Times New Roman"/>
+          <w:sz w:val="21"/>
         </w:rPr>
-        <w:t>Paper 2: Semantic Strategy Memory with Rule-Based Meta-Control</w:t>
+        <w:t>and 5. Historical figures are retained for audit but not used as submission-level performance evidence.</w:t>
+      </w:r>
+    </w:p>
+    <w:p>
+      <w:pPr>
+        <w:pStyle w:val="ListBullet"/>
+      </w:pPr>
+      <w:r>
+        <w:rPr>
+          <w:rFonts w:ascii="Courier New" w:hAnsi="Courier New" w:eastAsia="Courier New"/>
+          <w:sz w:val="19"/>
+        </w:rPr>
+        <w:t>reviews/artifact_checklist.txt</w:t>
+      </w:r>
+      <w:r>
+        <w:rPr>
+          <w:rFonts w:ascii="Times New Roman" w:hAnsi="Times New Roman" w:eastAsia="Times New Roman"/>
+          <w:sz w:val="21"/>
+        </w:rPr>
+        <w:t>: disk-presence audit, not a quality score</w:t>
+      </w:r>
+    </w:p>
+    <w:p>
+      <w:pPr>
+        <w:pStyle w:val="Heading1"/>
+      </w:pPr>
+      <w:r>
+        <w:rPr>
+          <w:rFonts w:ascii="Times New Roman" w:hAnsi="Times New Roman" w:eastAsia="Times New Roman"/>
+          <w:sz w:val="28"/>
+        </w:rPr>
+        <w:t>Submission Blockers</w:t>
       </w:r>
     </w:p>
     <w:p>
       <w:r>
         <w:rPr>
-          <w:rFonts w:ascii="Times New Roman" w:hAnsi="Times New Roman"/>
-          <w:sz w:val="22"/>
+          <w:rFonts w:ascii="Times New Roman" w:hAnsi="Times New Roman" w:eastAsia="Times New Roman"/>
+          <w:sz w:val="21"/>
         </w:rPr>
-        <w:t>Key Result: 51% → 58%; 71% stuck recovery</w:t>
+        <w:t xml:space="preserve">Before external submission, supply final author names and affiliations, replace repository URL placeholders, run a clean repeated experiment with explicit seeds and isolated output directories, and pass </w:t>
       </w:r>
-    </w:p>
-    <w:p>
-      <w:pPr>
-        <w:pStyle w:val="Heading2"/>
-      </w:pPr>
       <w:r>
         <w:rPr>
-          <w:rFonts w:ascii="Times New Roman" w:hAnsi="Times New Roman"/>
-          <w:color w:val="003366"/>
+          <w:rFonts w:ascii="Courier New" w:hAnsi="Courier New" w:eastAsia="Courier New"/>
+          <w:sz w:val="19"/>
         </w:rPr>
-        <w:t>Paper 3: Continual Learning Loop with A/B Safety Gate</w:t>
+        <w:t>python scripts/preflight_submission.py</w:t>
+      </w:r>
+      <w:r>
+        <w:rPr>
+          <w:rFonts w:ascii="Times New Roman" w:hAnsi="Times New Roman" w:eastAsia="Times New Roman"/>
+          <w:sz w:val="21"/>
+        </w:rPr>
+        <w:t xml:space="preserve"> from a clean Git worktree.</w:t>
       </w:r>
     </w:p>
     <w:p>
       <w:r>
         <w:rPr>
-          <w:rFonts w:ascii="Times New Roman" w:hAnsi="Times New Roman"/>
-          <w:sz w:val="22"/>
+          <w:rFonts w:ascii="Times New Roman" w:hAnsi="Times New Roman" w:eastAsia="Times New Roman"/>
+          <w:sz w:val="21"/>
         </w:rPr>
-        <w:t>Paper 3: Continual Learning Loop with A/B Safety Gate</w:t>
+        <w:t xml:space="preserve">The predecessor five-paper bundle is retained in </w:t>
       </w:r>
-    </w:p>
-    <w:p>
       <w:r>
         <w:rPr>
-          <w:rFonts w:ascii="Times New Roman" w:hAnsi="Times New Roman"/>
-          <w:sz w:val="22"/>
+          <w:rFonts w:ascii="Courier New" w:hAnsi="Courier New" w:eastAsia="Courier New"/>
+          <w:sz w:val="19"/>
         </w:rPr>
-        <w:t>Key Result: eval_new_acc +23% over 7 generations</w:t>
+        <w:t>_deprecated/</w:t>
       </w:r>
-    </w:p>
-    <w:p>
-      <w:pPr>
-        <w:pStyle w:val="Heading2"/>
-      </w:pPr>
       <w:r>
         <w:rPr>
-          <w:rFonts w:ascii="Times New Roman" w:hAnsi="Times New Roman"/>
-          <w:color w:val="003366"/>
+          <w:rFonts w:ascii="Times New Roman" w:hAnsi="Times New Roman" w:eastAsia="Times New Roman"/>
+          <w:sz w:val="21"/>
         </w:rPr>
-        <w:t>Paper 4: Bounded Recursive Self-Modification</w:t>
-      </w:r>
-    </w:p>
-    <w:p>
-      <w:r>
-        <w:rPr>
-          <w:rFonts w:ascii="Times New Roman" w:hAnsi="Times New Roman"/>
-          <w:sz w:val="22"/>
-        </w:rPr>
-        <w:t>Paper 4: Bounded Recursive Self-Modification</w:t>
-      </w:r>
-    </w:p>
-    <w:p>
-      <w:r>
-        <w:rPr>
-          <w:rFonts w:ascii="Times New Roman" w:hAnsi="Times New Roman"/>
-          <w:sz w:val="22"/>
-        </w:rPr>
-        <w:t>Key Result: 2 schema + 3 tool + 4 prompt mutations</w:t>
-      </w:r>
-    </w:p>
-    <w:p>
-      <w:pPr>
-        <w:pStyle w:val="Heading2"/>
-      </w:pPr>
-      <w:r>
-        <w:rPr>
-          <w:rFonts w:ascii="Times New Roman" w:hAnsi="Times New Roman"/>
-          <w:color w:val="003366"/>
-        </w:rPr>
-        <w:t>Paper 5: End-to-End Self-Improving Architecture on Consumer Hardware</w:t>
-      </w:r>
-    </w:p>
-    <w:p>
-      <w:r>
-        <w:rPr>
-          <w:rFonts w:ascii="Times New Roman" w:hAnsi="Times New Roman"/>
-          <w:sz w:val="22"/>
-        </w:rPr>
-        <w:t>Paper 5: End-to-End Self-Improving Architecture on Consumer Hardware</w:t>
-      </w:r>
-    </w:p>
-    <w:p>
-      <w:r>
-        <w:rPr>
-          <w:rFonts w:ascii="Times New Roman" w:hAnsi="Times New Roman"/>
-          <w:sz w:val="22"/>
-        </w:rPr>
-        <w:t>Key Result: 68.5% success rate, ~5 GB RAM</w:t>
+        <w:t xml:space="preserve"> for history only and is not the submission of record.</w:t>
       </w:r>
     </w:p>
     <w:sectPr>
-      <w:pgSz w:w="12240" w:h="15840"/>
-      <w:pgMar w:top="1440" w:right="1800" w:bottom="1440" w:left="1800" w:header="720" w:footer="720" w:gutter="0"/>
+      <w:footerReference w:type="default" r:id="rId9"/>
+      <w:pgSz w:w="11906" w:h="16838"/>
+      <w:pgMar w:top="1077" w:right="1077" w:bottom="1077" w:left="1077" w:header="720" w:footer="720" w:gutter="0"/>
       <w:cols w:space="720"/>
       <w:docGrid w:linePitch="360"/>
     </w:sectPr>
   </w:body>
 </w:document>
+</file>
+
+<file path=word/footer1.xml><?xml version="1.0" encoding="utf-8"?>
+<w:ftr xmlns:m="http://schemas.openxmlformats.org/officeDocument/2006/math" xmlns:mc="http://schemas.openxmlformats.org/markup-compatibility/2006" xmlns:mo="http://schemas.microsoft.com/office/mac/office/2008/main" xmlns:mv="urn:schemas-microsoft-com:mac:vml" xmlns:o="urn:schemas-microsoft-com:office:office" xmlns:r="http://schemas.openxmlformats.org/officeDocument/2006/relationships" xmlns:v="urn:schemas-microsoft-com:vml" xmlns:w10="urn:schemas-microsoft-com:office:word" xmlns:w14="http://schemas.microsoft.com/office/word/2010/wordml" xmlns:w="http://schemas.openxmlformats.org/wordprocessingml/2006/main" xmlns:wne="http://schemas.microsoft.com/office/word/2006/wordml" xmlns:wp14="http://schemas.microsoft.com/office/word/2010/wordprocessingDrawing" xmlns:wp="http://schemas.openxmlformats.org/drawingml/2006/wordprocessingDrawing" xmlns:wpc="http://schemas.microsoft.com/office/word/2010/wordprocessingCanvas" xmlns:wpg="http://schemas.microsoft.com/office/word/2010/wordprocessingGroup" xmlns:wpi="http://schemas.microsoft.com/office/word/2010/wordprocessingInk" xmlns:wps="http://schemas.microsoft.com/office/word/2010/wordprocessingShape" mc:Ignorable="w14 wp14">
+  <w:p>
+    <w:pPr>
+      <w:pStyle w:val="Footer"/>
+      <w:jc w:val="center"/>
+    </w:pPr>
+    <w:r>
+      <w:rPr>
+        <w:rFonts w:ascii="Times New Roman" w:hAnsi="Times New Roman" w:eastAsia="Times New Roman"/>
+        <w:sz w:val="18"/>
+      </w:rPr>
+      <w:t xml:space="preserve">Page </w:t>
+    </w:r>
+    <w:fldSimple w:instr="PAGE"/>
+  </w:p>
+</w:ftr>
 </file>
 
 <file path=word/numbering.xml><?xml version="1.0" encoding="utf-8"?>
@@ -595,11 +959,11 @@
     <w:qFormat/>
     <w:rsid w:val="00FC693F"/>
     <w:pPr>
-      <w:spacing w:line="360" w:lineRule="auto" w:after="120"/>
+      <w:spacing w:line="269" w:lineRule="auto" w:after="80"/>
     </w:pPr>
     <w:rPr>
       <w:rFonts w:ascii="Times New Roman" w:hAnsi="Times New Roman"/>
-      <w:sz w:val="22"/>
+      <w:sz w:val="21"/>
     </w:rPr>
   </w:style>
   <w:style w:type="paragraph" w:styleId="Header">
@@ -657,14 +1021,14 @@
     <w:pPr>
       <w:keepNext/>
       <w:keepLines/>
-      <w:spacing w:before="480" w:after="0"/>
+      <w:spacing w:before="200" w:after="80"/>
       <w:outlineLvl w:val="0"/>
     </w:pPr>
     <w:rPr>
-      <w:rFonts w:asciiTheme="majorHAnsi" w:eastAsiaTheme="majorEastAsia" w:hAnsiTheme="majorHAnsi" w:cstheme="majorBidi"/>
+      <w:rFonts w:asciiTheme="majorHAnsi" w:eastAsiaTheme="majorEastAsia" w:hAnsiTheme="majorHAnsi" w:cstheme="majorBidi" w:ascii="Times New Roman" w:hAnsi="Times New Roman"/>
       <w:b/>
       <w:bCs/>
-      <w:color w:val="365F91" w:themeColor="accent1" w:themeShade="BF"/>
+      <w:color w:val="000000"/>
       <w:sz w:val="28"/>
       <w:szCs w:val="28"/>
     </w:rPr>
@@ -681,15 +1045,15 @@
     <w:pPr>
       <w:keepNext/>
       <w:keepLines/>
-      <w:spacing w:before="200" w:after="0"/>
+      <w:spacing w:before="160" w:after="60"/>
       <w:outlineLvl w:val="1"/>
     </w:pPr>
     <w:rPr>
-      <w:rFonts w:asciiTheme="majorHAnsi" w:eastAsiaTheme="majorEastAsia" w:hAnsiTheme="majorHAnsi" w:cstheme="majorBidi"/>
+      <w:rFonts w:asciiTheme="majorHAnsi" w:eastAsiaTheme="majorEastAsia" w:hAnsiTheme="majorHAnsi" w:cstheme="majorBidi" w:ascii="Times New Roman" w:hAnsi="Times New Roman"/>
       <w:b/>
       <w:bCs/>
-      <w:color w:val="4F81BD" w:themeColor="accent1"/>
-      <w:sz w:val="26"/>
+      <w:color w:val="000000"/>
+      <w:sz w:val="24"/>
       <w:szCs w:val="26"/>
     </w:rPr>
   </w:style>
@@ -705,14 +1069,15 @@
     <w:pPr>
       <w:keepNext/>
       <w:keepLines/>
-      <w:spacing w:before="200" w:after="0"/>
+      <w:spacing w:before="140" w:after="40"/>
       <w:outlineLvl w:val="2"/>
     </w:pPr>
     <w:rPr>
-      <w:rFonts w:asciiTheme="majorHAnsi" w:eastAsiaTheme="majorEastAsia" w:hAnsiTheme="majorHAnsi" w:cstheme="majorBidi"/>
+      <w:rFonts w:asciiTheme="majorHAnsi" w:eastAsiaTheme="majorEastAsia" w:hAnsiTheme="majorHAnsi" w:cstheme="majorBidi" w:ascii="Times New Roman" w:hAnsi="Times New Roman"/>
       <w:b/>
       <w:bCs/>
-      <w:color w:val="4F81BD" w:themeColor="accent1"/>
+      <w:color w:val="000000"/>
+      <w:sz w:val="22"/>
     </w:rPr>
   </w:style>
   <w:style w:type="paragraph" w:styleId="Heading4">
@@ -946,15 +1311,16 @@
       <w:pBdr>
         <w:bottom w:val="single" w:sz="8" w:space="4" w:color="4F81BD" w:themeColor="accent1"/>
       </w:pBdr>
-      <w:spacing w:after="300" w:line="240" w:lineRule="auto"/>
+      <w:spacing w:after="160" w:line="240" w:lineRule="auto"/>
       <w:contextualSpacing/>
     </w:pPr>
     <w:rPr>
-      <w:rFonts w:asciiTheme="majorHAnsi" w:eastAsiaTheme="majorEastAsia" w:hAnsiTheme="majorHAnsi" w:cstheme="majorBidi"/>
-      <w:color w:val="17365D" w:themeColor="text2" w:themeShade="BF"/>
+      <w:rFonts w:asciiTheme="majorHAnsi" w:eastAsiaTheme="majorEastAsia" w:hAnsiTheme="majorHAnsi" w:cstheme="majorBidi" w:ascii="Times New Roman" w:hAnsi="Times New Roman"/>
+      <w:b/>
+      <w:color w:val="000000"/>
       <w:spacing w:val="5"/>
       <w:kern w:val="28"/>
-      <w:sz w:val="52"/>
+      <w:sz w:val="34"/>
       <w:szCs w:val="52"/>
     </w:rPr>
   </w:style>

</xml_diff>

<commit_message>
Author metadata: Zewen Liu (independent researcher, ORCID 0009-0003-2981-9888)
- Manuscript, index, and cover letter now carry final author metadata
- pyproject authors updated; repository URL placeholders remain
- PDF/DOCX rebuilt
</commit_message>
<xml_diff>
--- a/papers/docx/00_INDEX.docx
+++ b/papers/docx/00_INDEX.docx
@@ -42,7 +42,7 @@
           <w:rFonts w:ascii="Times New Roman" w:hAnsi="Times New Roman" w:eastAsia="Times New Roman"/>
           <w:sz w:val="21"/>
         </w:rPr>
-        <w:t xml:space="preserve"> AGI Research Kit Contributors </w:t>
+        <w:t xml:space="preserve"> Zewen Liu (刘泽文) </w:t>
       </w:r>
       <w:r>
         <w:rPr>
@@ -73,6 +73,40 @@
           <w:sz w:val="21"/>
         </w:rPr>
         <w:t xml:space="preserve"> Submission draft; not yet submitted</w:t>
+      </w:r>
+    </w:p>
+    <w:p>
+      <w:r>
+        <w:rPr>
+          <w:rFonts w:ascii="Times New Roman" w:hAnsi="Times New Roman" w:eastAsia="Times New Roman"/>
+          <w:b/>
+          <w:sz w:val="21"/>
+        </w:rPr>
+        <w:t>Affiliation:</w:t>
+      </w:r>
+      <w:r>
+        <w:rPr>
+          <w:rFonts w:ascii="Times New Roman" w:hAnsi="Times New Roman" w:eastAsia="Times New Roman"/>
+          <w:sz w:val="21"/>
+        </w:rPr>
+        <w:t xml:space="preserve"> Independent researcher</w:t>
+      </w:r>
+    </w:p>
+    <w:p>
+      <w:r>
+        <w:rPr>
+          <w:rFonts w:ascii="Times New Roman" w:hAnsi="Times New Roman" w:eastAsia="Times New Roman"/>
+          <w:b/>
+          <w:sz w:val="21"/>
+        </w:rPr>
+        <w:t>ORCID:</w:t>
+      </w:r>
+      <w:r>
+        <w:rPr>
+          <w:rFonts w:ascii="Times New Roman" w:hAnsi="Times New Roman" w:eastAsia="Times New Roman"/>
+          <w:sz w:val="21"/>
+        </w:rPr>
+        <w:t xml:space="preserve"> https://orcid.org/0009-0003-2981-9888</w:t>
       </w:r>
     </w:p>
     <w:p>

</xml_diff>

<commit_message>
Add guarded self-evolving loop experiment (Section 7.7, 10 rounds) and rebuild artifacts
- New Section 7.7: controlled 10-round observe->diagnose->propose->evaluate->promote/reject experiment
  (guarded skill transfer, amendments A-K, majority voting, placebo controls, conflict scanner)
- Findings: 8 conservative REJECTs, 2 safety-pass PROMOTEs, no delta>0; injection-mechanism vs
  skill-content separation; direction-specific harm taxonomy; efficiency cost of injection
- Update 00_INDEX evidence summary; rebuild PDF/DOCX artifacts
</commit_message>
<xml_diff>
--- a/papers/docx/00_INDEX.docx
+++ b/papers/docx/00_INDEX.docx
@@ -313,6 +313,27 @@
           <w:sz w:val="21"/>
         </w:rPr>
         <w:t xml:space="preserve"> deterministic boundary cases passed.</w:t>
+      </w:r>
+    </w:p>
+    <w:p>
+      <w:pPr>
+        <w:pStyle w:val="ListBullet"/>
+      </w:pPr>
+      <w:r>
+        <w:rPr>
+          <w:rFonts w:ascii="Times New Roman" w:hAnsi="Times New Roman" w:eastAsia="Times New Roman"/>
+          <w:sz w:val="21"/>
+        </w:rPr>
+        <w:t>Guarded self-evolving loop (Section 7.7, 10 rounds): 8 conservative</w:t>
+      </w:r>
+    </w:p>
+    <w:p>
+      <w:r>
+        <w:rPr>
+          <w:rFonts w:ascii="Times New Roman" w:hAnsi="Times New Roman" w:eastAsia="Times New Roman"/>
+          <w:sz w:val="21"/>
+        </w:rPr>
+        <w:t>REJECTs (6 on genuinely injected rounds), 2 safety-pass PROMOTEs REJECTs, 2 safety-pass PROMOTEs (delta=0.0), zero net-positive rounds; placebo-controlled skill-specific gains (tool_03/tool_h3) and direction-specific harm (tool_04/state_h3/state_01) documented with fixed rechecks and conflict scans.</w:t>
       </w:r>
     </w:p>
     <w:p>

</xml_diff>